<commit_message>
docs: them screenshot that vao bao cao CT484
</commit_message>
<xml_diff>
--- a/docs/Baocao_BK24V7X414_DoChiVuong.docx
+++ b/docs/Baocao_BK24V7X414_DoChiVuong.docx
@@ -48,7 +48,7 @@
     <w:p/>
     <w:p>
       <w:r>
-        <w:t>Miêu tả dự án/ứng dụng: CafeSpot là ứng dụng Flutter giúp người dùng khám phá, thêm/sửa/xóa quán cà phê, đánh giá và lưu yêu thích. Dữ liệu lưu cục bộ bằng SQLite, điều hướng bằng go_router, quản lý trạng thái bằng Provider, có thông báo cục bộ và giao diện responsive. Dự án thực hiện theo nhóm 2 thành viên.</w:t>
+        <w:t>Miêu tả dự án/ứng dụng: CafeSpot là ứng dụng Flutter giúp người dùng khám phá, thêm/sửa/xóa quán cà phê, đánh giá và lưu yêu thích. Dữ liệu lưu cục bộ bằng SQLite (mobile), điều hướng bằng go_router, quản lý trạng thái bằng Provider, có thông báo cục bộ và giao diện responsive. Dự án thực hiện theo nhóm 2 thành viên.</w:t>
       </w:r>
     </w:p>
     <w:p>
@@ -66,12 +66,51 @@
     </w:p>
     <w:p>
       <w:r>
-        <w:t>Miêu tả chức năng/giao diện: Hiển thị các quán is_favorite=1 dạng GridView responsive; bỏ yêu thích hoặc mở chi tiết.</w:t>
+        <w:t>Miêu tả chức năng/giao diện: Hiển thị quán yêu thích dạng GridView; bỏ yêu thích hoặc mở chi tiết.</w:t>
       </w:r>
     </w:p>
     <w:p>
       <w:r>
-        <w:t>Ảnh chức năng/giao diện: (sinh viên chụp màn hình khi chạy app và chèn vào đây)</w:t>
+        <w:t>Ảnh chức năng/giao diện:</w:t>
+      </w:r>
+    </w:p>
+    <w:p>
+      <w:pPr>
+        <w:jc w:val="center"/>
+      </w:pPr>
+      <w:r>
+        <w:drawing>
+          <wp:inline xmlns:a="http://schemas.openxmlformats.org/drawingml/2006/main" xmlns:pic="http://schemas.openxmlformats.org/drawingml/2006/picture">
+            <wp:extent cx="3420000" cy="1739563"/>
+            <wp:docPr id="1" name="Picture 1"/>
+            <wp:cNvGraphicFramePr>
+              <a:graphicFrameLocks noChangeAspect="1"/>
+            </wp:cNvGraphicFramePr>
+            <a:graphic>
+              <a:graphicData uri="http://schemas.openxmlformats.org/drawingml/2006/picture">
+                <pic:pic>
+                  <pic:nvPicPr>
+                    <pic:cNvPr id="0" name="favorites.png"/>
+                    <pic:cNvPicPr/>
+                  </pic:nvPicPr>
+                  <pic:blipFill>
+                    <a:blip r:embed="rId9"/>
+                    <a:stretch>
+                      <a:fillRect/>
+                    </a:stretch>
+                  </pic:blipFill>
+                  <pic:spPr>
+                    <a:xfrm>
+                      <a:off x="0" y="0"/>
+                      <a:ext cx="3420000" cy="1739563"/>
+                    </a:xfrm>
+                    <a:prstGeom prst="rect"/>
+                  </pic:spPr>
+                </pic:pic>
+              </a:graphicData>
+            </a:graphic>
+          </wp:inline>
+        </w:drawing>
       </w:r>
     </w:p>
     <w:p>
@@ -96,7 +135,7 @@
     </w:p>
     <w:p>
       <w:r>
-        <w:t>- Đọc/lưu trữ dữ liệu: SELECT cafes WHERE is_favorite=1; UPDATE is_favorite khi toggle.</w:t>
+        <w:t>- Đọc/lưu trữ dữ liệu: SELECT cafes WHERE is_favorite=1.</w:t>
       </w:r>
     </w:p>
     <w:p>
@@ -109,12 +148,51 @@
     </w:p>
     <w:p>
       <w:r>
-        <w:t>Miêu tả chức năng/giao diện: ListView toàn bộ review đã lưu; mở quán tương ứng hoặc xóa review.</w:t>
+        <w:t>Miêu tả chức năng/giao diện: ListView toàn bộ review; mở quán hoặc xóa review.</w:t>
       </w:r>
     </w:p>
     <w:p>
       <w:r>
-        <w:t>Ảnh chức năng/giao diện: (sinh viên chụp màn hình khi chạy app và chèn vào đây)</w:t>
+        <w:t>Ảnh chức năng/giao diện:</w:t>
+      </w:r>
+    </w:p>
+    <w:p>
+      <w:pPr>
+        <w:jc w:val="center"/>
+      </w:pPr>
+      <w:r>
+        <w:drawing>
+          <wp:inline xmlns:a="http://schemas.openxmlformats.org/drawingml/2006/main" xmlns:pic="http://schemas.openxmlformats.org/drawingml/2006/picture">
+            <wp:extent cx="3420000" cy="3823560"/>
+            <wp:docPr id="2" name="Picture 2"/>
+            <wp:cNvGraphicFramePr>
+              <a:graphicFrameLocks noChangeAspect="1"/>
+            </wp:cNvGraphicFramePr>
+            <a:graphic>
+              <a:graphicData uri="http://schemas.openxmlformats.org/drawingml/2006/picture">
+                <pic:pic>
+                  <pic:nvPicPr>
+                    <pic:cNvPr id="0" name="reviews.png"/>
+                    <pic:cNvPicPr/>
+                  </pic:nvPicPr>
+                  <pic:blipFill>
+                    <a:blip r:embed="rId10"/>
+                    <a:stretch>
+                      <a:fillRect/>
+                    </a:stretch>
+                  </pic:blipFill>
+                  <pic:spPr>
+                    <a:xfrm>
+                      <a:off x="0" y="0"/>
+                      <a:ext cx="3420000" cy="3823560"/>
+                    </a:xfrm>
+                    <a:prstGeom prst="rect"/>
+                  </pic:spPr>
+                </pic:pic>
+              </a:graphicData>
+            </a:graphic>
+          </wp:inline>
+        </w:drawing>
       </w:r>
     </w:p>
     <w:p>
@@ -124,7 +202,7 @@
     </w:p>
     <w:p>
       <w:r>
-        <w:t>- Widget sử dụng: ListView.separated, Card, ListTile, RatingStars, IconButton</w:t>
+        <w:t>- Widget sử dụng: ListView.separated, Card, ListTile, RatingStars</w:t>
       </w:r>
     </w:p>
     <w:p>
@@ -139,7 +217,7 @@
     </w:p>
     <w:p>
       <w:r>
-        <w:t>- Đọc/lưu trữ dữ liệu: Đọc/xóa bảng reviews; recalculate rating quán.</w:t>
+        <w:t>- Đọc/lưu trữ dữ liệu: Đọc/xóa bảng reviews.</w:t>
       </w:r>
     </w:p>
     <w:p>
@@ -152,12 +230,51 @@
     </w:p>
     <w:p>
       <w:r>
-        <w:t>Miêu tả chức năng/giao diện: Ô tìm kiếm theo tên/địa chỉ/mô tả; kết quả ListView; nhận query qua query param q.</w:t>
+        <w:t>Miêu tả chức năng/giao diện: Tìm theo tên/địa chỉ/mô tả; kết quả ListView.</w:t>
       </w:r>
     </w:p>
     <w:p>
       <w:r>
-        <w:t>Ảnh chức năng/giao diện: (sinh viên chụp màn hình khi chạy app và chèn vào đây)</w:t>
+        <w:t>Ảnh chức năng/giao diện:</w:t>
+      </w:r>
+    </w:p>
+    <w:p>
+      <w:pPr>
+        <w:jc w:val="center"/>
+      </w:pPr>
+      <w:r>
+        <w:drawing>
+          <wp:inline xmlns:a="http://schemas.openxmlformats.org/drawingml/2006/main" xmlns:pic="http://schemas.openxmlformats.org/drawingml/2006/picture">
+            <wp:extent cx="3420000" cy="3823560"/>
+            <wp:docPr id="3" name="Picture 3"/>
+            <wp:cNvGraphicFramePr>
+              <a:graphicFrameLocks noChangeAspect="1"/>
+            </wp:cNvGraphicFramePr>
+            <a:graphic>
+              <a:graphicData uri="http://schemas.openxmlformats.org/drawingml/2006/picture">
+                <pic:pic>
+                  <pic:nvPicPr>
+                    <pic:cNvPr id="0" name="search.png"/>
+                    <pic:cNvPicPr/>
+                  </pic:nvPicPr>
+                  <pic:blipFill>
+                    <a:blip r:embed="rId11"/>
+                    <a:stretch>
+                      <a:fillRect/>
+                    </a:stretch>
+                  </pic:blipFill>
+                  <pic:spPr>
+                    <a:xfrm>
+                      <a:off x="0" y="0"/>
+                      <a:ext cx="3420000" cy="3823560"/>
+                    </a:xfrm>
+                    <a:prstGeom prst="rect"/>
+                  </pic:spPr>
+                </pic:pic>
+              </a:graphicData>
+            </a:graphic>
+          </wp:inline>
+        </w:drawing>
       </w:r>
     </w:p>
     <w:p>
@@ -172,7 +289,7 @@
     </w:p>
     <w:p>
       <w:r>
-        <w:t>- Thư viện/plugin: go_router (queryParameters), provider</w:t>
+        <w:t>- Thư viện/plugin: go_router, provider</w:t>
       </w:r>
     </w:p>
     <w:p>
@@ -195,12 +312,51 @@
     </w:p>
     <w:p>
       <w:r>
-        <w:t>Miêu tả chức năng/giao diện: Đổi tên hiển thị, dark mode, bật/tắt thông báo, gửi notification thử, thông tin nhóm.</w:t>
+        <w:t>Miêu tả chức năng/giao diện: Đổi tên hiển thị, dark mode, bật/tắt thông báo, gửi notification thử.</w:t>
       </w:r>
     </w:p>
     <w:p>
       <w:r>
-        <w:t>Ảnh chức năng/giao diện: (sinh viên chụp màn hình khi chạy app và chèn vào đây)</w:t>
+        <w:t>Ảnh chức năng/giao diện:</w:t>
+      </w:r>
+    </w:p>
+    <w:p>
+      <w:pPr>
+        <w:jc w:val="center"/>
+      </w:pPr>
+      <w:r>
+        <w:drawing>
+          <wp:inline xmlns:a="http://schemas.openxmlformats.org/drawingml/2006/main" xmlns:pic="http://schemas.openxmlformats.org/drawingml/2006/picture">
+            <wp:extent cx="3420000" cy="3823560"/>
+            <wp:docPr id="4" name="Picture 4"/>
+            <wp:cNvGraphicFramePr>
+              <a:graphicFrameLocks noChangeAspect="1"/>
+            </wp:cNvGraphicFramePr>
+            <a:graphic>
+              <a:graphicData uri="http://schemas.openxmlformats.org/drawingml/2006/picture">
+                <pic:pic>
+                  <pic:nvPicPr>
+                    <pic:cNvPr id="0" name="settings.png"/>
+                    <pic:cNvPicPr/>
+                  </pic:nvPicPr>
+                  <pic:blipFill>
+                    <a:blip r:embed="rId12"/>
+                    <a:stretch>
+                      <a:fillRect/>
+                    </a:stretch>
+                  </pic:blipFill>
+                  <pic:spPr>
+                    <a:xfrm>
+                      <a:off x="0" y="0"/>
+                      <a:ext cx="3420000" cy="3823560"/>
+                    </a:xfrm>
+                    <a:prstGeom prst="rect"/>
+                  </pic:spPr>
+                </pic:pic>
+              </a:graphicData>
+            </a:graphic>
+          </wp:inline>
+        </w:drawing>
       </w:r>
     </w:p>
     <w:p>
@@ -220,7 +376,7 @@
     </w:p>
     <w:p>
       <w:r>
-        <w:t>- Quản lý trạng thái / kiến trúc: SettingsProvider (ChangeNotifier) lưu SharedPreferences.</w:t>
+        <w:t>- Quản lý trạng thái / kiến trúc: SettingsProvider + SharedPreferences.</w:t>
       </w:r>
     </w:p>
     <w:p>
@@ -238,12 +394,51 @@
     </w:p>
     <w:p>
       <w:r>
-        <w:t>Miêu tả chức năng/giao diện: Khởi tạo plugin, xin quyền Android 13+, kênh CafeSpot; thông báo khi thêm quán/đánh giá hoặc nút thử.</w:t>
+        <w:t>Miêu tả chức năng/giao diện: Khởi tạo plugin, kênh CafeSpot; thông báo khi thêm quán/đánh giá hoặc nút thử.</w:t>
       </w:r>
     </w:p>
     <w:p>
       <w:r>
-        <w:t>Ảnh chức năng/giao diện: (sinh viên chụp màn hình khi chạy app và chèn vào đây)</w:t>
+        <w:t>Ảnh chức năng/giao diện:</w:t>
+      </w:r>
+    </w:p>
+    <w:p>
+      <w:pPr>
+        <w:jc w:val="center"/>
+      </w:pPr>
+      <w:r>
+        <w:drawing>
+          <wp:inline xmlns:a="http://schemas.openxmlformats.org/drawingml/2006/main" xmlns:pic="http://schemas.openxmlformats.org/drawingml/2006/picture">
+            <wp:extent cx="3420000" cy="3823560"/>
+            <wp:docPr id="5" name="Picture 5"/>
+            <wp:cNvGraphicFramePr>
+              <a:graphicFrameLocks noChangeAspect="1"/>
+            </wp:cNvGraphicFramePr>
+            <a:graphic>
+              <a:graphicData uri="http://schemas.openxmlformats.org/drawingml/2006/picture">
+                <pic:pic>
+                  <pic:nvPicPr>
+                    <pic:cNvPr id="0" name="settings.png"/>
+                    <pic:cNvPicPr/>
+                  </pic:nvPicPr>
+                  <pic:blipFill>
+                    <a:blip r:embed="rId12"/>
+                    <a:stretch>
+                      <a:fillRect/>
+                    </a:stretch>
+                  </pic:blipFill>
+                  <pic:spPr>
+                    <a:xfrm>
+                      <a:off x="0" y="0"/>
+                      <a:ext cx="3420000" cy="3823560"/>
+                    </a:xfrm>
+                    <a:prstGeom prst="rect"/>
+                  </pic:spPr>
+                </pic:pic>
+              </a:graphicData>
+            </a:graphic>
+          </wp:inline>
+        </w:drawing>
       </w:r>
     </w:p>
     <w:p>
@@ -253,7 +448,7 @@
     </w:p>
     <w:p>
       <w:r>
-        <w:t>- Widget sử dụng: Gọi từ Settings/Detail/Form (không UI riêng)</w:t>
+        <w:t>- Widget sử dụng: Gọi từ Settings/Detail/Form</w:t>
       </w:r>
     </w:p>
     <w:p>
@@ -268,7 +463,7 @@
     </w:p>
     <w:p>
       <w:r>
-        <w:t>- Đọc/lưu trữ dữ liệu: Không lưu nội dung notification; chỉ hiển thị cục bộ.</w:t>
+        <w:t>- Đọc/lưu trữ dữ liệu: Không lưu nội dung notification.</w:t>
       </w:r>
     </w:p>
     <w:p>
@@ -276,17 +471,56 @@
         <w:pStyle w:val="Heading1"/>
       </w:pPr>
       <w:r>
-        <w:t>Chức năng/giao diện 6: Responsive layout &amp; Shell navigation</w:t>
+        <w:t>Chức năng/giao diện 6: Responsive layout &amp; Shell</w:t>
       </w:r>
     </w:p>
     <w:p>
       <w:r>
-        <w:t>Miêu tả chức năng/giao diện: ShellScaffold dùng NavigationBar (mobile) hoặc NavigationRail (width&gt;=800); ResponsiveCenter giới hạn maxWidth.</w:t>
+        <w:t>Miêu tả chức năng/giao diện: NavigationBar (mobile) hoặc NavigationRail (rộng); ResponsiveCenter.</w:t>
       </w:r>
     </w:p>
     <w:p>
       <w:r>
-        <w:t>Ảnh chức năng/giao diện: (sinh viên chụp màn hình khi chạy app và chèn vào đây)</w:t>
+        <w:t>Ảnh chức năng/giao diện:</w:t>
+      </w:r>
+    </w:p>
+    <w:p>
+      <w:pPr>
+        <w:jc w:val="center"/>
+      </w:pPr>
+      <w:r>
+        <w:drawing>
+          <wp:inline xmlns:a="http://schemas.openxmlformats.org/drawingml/2006/main" xmlns:pic="http://schemas.openxmlformats.org/drawingml/2006/picture">
+            <wp:extent cx="3420000" cy="1739563"/>
+            <wp:docPr id="6" name="Picture 6"/>
+            <wp:cNvGraphicFramePr>
+              <a:graphicFrameLocks noChangeAspect="1"/>
+            </wp:cNvGraphicFramePr>
+            <a:graphic>
+              <a:graphicData uri="http://schemas.openxmlformats.org/drawingml/2006/picture">
+                <pic:pic>
+                  <pic:nvPicPr>
+                    <pic:cNvPr id="0" name="home.png"/>
+                    <pic:cNvPicPr/>
+                  </pic:nvPicPr>
+                  <pic:blipFill>
+                    <a:blip r:embed="rId13"/>
+                    <a:stretch>
+                      <a:fillRect/>
+                    </a:stretch>
+                  </pic:blipFill>
+                  <pic:spPr>
+                    <a:xfrm>
+                      <a:off x="0" y="0"/>
+                      <a:ext cx="3420000" cy="1739563"/>
+                    </a:xfrm>
+                    <a:prstGeom prst="rect"/>
+                  </pic:spPr>
+                </pic:pic>
+              </a:graphicData>
+            </a:graphic>
+          </wp:inline>
+        </w:drawing>
       </w:r>
     </w:p>
     <w:p>
@@ -296,7 +530,7 @@
     </w:p>
     <w:p>
       <w:r>
-        <w:t>- Widget sử dụng: NavigationBar, NavigationRail, LayoutBuilder, Padding</w:t>
+        <w:t>- Widget sử dụng: NavigationBar, NavigationRail, LayoutBuilder</w:t>
       </w:r>
     </w:p>
     <w:p>

</xml_diff>

<commit_message>
docs: cap nhat screenshot Android + bao cao CT484
</commit_message>
<xml_diff>
--- a/docs/Baocao_BK24V7X414_DoChiVuong.docx
+++ b/docs/Baocao_BK24V7X414_DoChiVuong.docx
@@ -81,7 +81,7 @@
       <w:r>
         <w:drawing>
           <wp:inline xmlns:a="http://schemas.openxmlformats.org/drawingml/2006/main" xmlns:pic="http://schemas.openxmlformats.org/drawingml/2006/picture">
-            <wp:extent cx="3420000" cy="1739563"/>
+            <wp:extent cx="3420000" cy="7410000"/>
             <wp:docPr id="1" name="Picture 1"/>
             <wp:cNvGraphicFramePr>
               <a:graphicFrameLocks noChangeAspect="1"/>
@@ -102,7 +102,7 @@
                   <pic:spPr>
                     <a:xfrm>
                       <a:off x="0" y="0"/>
-                      <a:ext cx="3420000" cy="1739563"/>
+                      <a:ext cx="3420000" cy="7410000"/>
                     </a:xfrm>
                     <a:prstGeom prst="rect"/>
                   </pic:spPr>
@@ -163,7 +163,7 @@
       <w:r>
         <w:drawing>
           <wp:inline xmlns:a="http://schemas.openxmlformats.org/drawingml/2006/main" xmlns:pic="http://schemas.openxmlformats.org/drawingml/2006/picture">
-            <wp:extent cx="3420000" cy="3823560"/>
+            <wp:extent cx="3420000" cy="7410000"/>
             <wp:docPr id="2" name="Picture 2"/>
             <wp:cNvGraphicFramePr>
               <a:graphicFrameLocks noChangeAspect="1"/>
@@ -184,7 +184,7 @@
                   <pic:spPr>
                     <a:xfrm>
                       <a:off x="0" y="0"/>
-                      <a:ext cx="3420000" cy="3823560"/>
+                      <a:ext cx="3420000" cy="7410000"/>
                     </a:xfrm>
                     <a:prstGeom prst="rect"/>
                   </pic:spPr>
@@ -245,7 +245,7 @@
       <w:r>
         <w:drawing>
           <wp:inline xmlns:a="http://schemas.openxmlformats.org/drawingml/2006/main" xmlns:pic="http://schemas.openxmlformats.org/drawingml/2006/picture">
-            <wp:extent cx="3420000" cy="3823560"/>
+            <wp:extent cx="3420000" cy="7410000"/>
             <wp:docPr id="3" name="Picture 3"/>
             <wp:cNvGraphicFramePr>
               <a:graphicFrameLocks noChangeAspect="1"/>
@@ -266,7 +266,7 @@
                   <pic:spPr>
                     <a:xfrm>
                       <a:off x="0" y="0"/>
-                      <a:ext cx="3420000" cy="3823560"/>
+                      <a:ext cx="3420000" cy="7410000"/>
                     </a:xfrm>
                     <a:prstGeom prst="rect"/>
                   </pic:spPr>
@@ -327,7 +327,7 @@
       <w:r>
         <w:drawing>
           <wp:inline xmlns:a="http://schemas.openxmlformats.org/drawingml/2006/main" xmlns:pic="http://schemas.openxmlformats.org/drawingml/2006/picture">
-            <wp:extent cx="3420000" cy="3823560"/>
+            <wp:extent cx="3420000" cy="7410000"/>
             <wp:docPr id="4" name="Picture 4"/>
             <wp:cNvGraphicFramePr>
               <a:graphicFrameLocks noChangeAspect="1"/>
@@ -348,7 +348,7 @@
                   <pic:spPr>
                     <a:xfrm>
                       <a:off x="0" y="0"/>
-                      <a:ext cx="3420000" cy="3823560"/>
+                      <a:ext cx="3420000" cy="7410000"/>
                     </a:xfrm>
                     <a:prstGeom prst="rect"/>
                   </pic:spPr>
@@ -409,7 +409,7 @@
       <w:r>
         <w:drawing>
           <wp:inline xmlns:a="http://schemas.openxmlformats.org/drawingml/2006/main" xmlns:pic="http://schemas.openxmlformats.org/drawingml/2006/picture">
-            <wp:extent cx="3420000" cy="3823560"/>
+            <wp:extent cx="3420000" cy="7410000"/>
             <wp:docPr id="5" name="Picture 5"/>
             <wp:cNvGraphicFramePr>
               <a:graphicFrameLocks noChangeAspect="1"/>
@@ -430,7 +430,7 @@
                   <pic:spPr>
                     <a:xfrm>
                       <a:off x="0" y="0"/>
-                      <a:ext cx="3420000" cy="3823560"/>
+                      <a:ext cx="3420000" cy="7410000"/>
                     </a:xfrm>
                     <a:prstGeom prst="rect"/>
                   </pic:spPr>
@@ -491,7 +491,7 @@
       <w:r>
         <w:drawing>
           <wp:inline xmlns:a="http://schemas.openxmlformats.org/drawingml/2006/main" xmlns:pic="http://schemas.openxmlformats.org/drawingml/2006/picture">
-            <wp:extent cx="3420000" cy="1739563"/>
+            <wp:extent cx="3420000" cy="7410000"/>
             <wp:docPr id="6" name="Picture 6"/>
             <wp:cNvGraphicFramePr>
               <a:graphicFrameLocks noChangeAspect="1"/>
@@ -512,7 +512,7 @@
                   <pic:spPr>
                     <a:xfrm>
                       <a:off x="0" y="0"/>
-                      <a:ext cx="3420000" cy="1739563"/>
+                      <a:ext cx="3420000" cy="7410000"/>
                     </a:xfrm>
                     <a:prstGeom prst="rect"/>
                   </pic:spPr>

</xml_diff>